<commit_message>
docs: enrich week 3-4 report with intuitive analogies, deep technical solutions, and bypass scenarios
</commit_message>
<xml_diff>
--- a/docs/BaoCao_ChuyenDeTotNghiep_OGK_Tuan3_4.docx
+++ b/docs/BaoCao_ChuyenDeTotNghiep_OGK_Tuan3_4.docx
@@ -248,16 +248,11 @@
     </w:p>
     <w:p>
       <w:r>
-        <w:t>Để lọc mạng mà không cần cài đặt chứng chỉ SSL/TLS gốc vào máy tính của trẻ, OGK can thiệp ở tầng phân giải tên miền (DNS - Lớp 7 OSI). Khi card mạng Wi-Fi/Ethernet trỏ về 127.0.0.1, mọi truy vấn tên miền của hệ điều hành đều đi qua Socket UDP nội bộ của Agent:</w:t>
-      </w:r>
-    </w:p>
-    <w:p>
-      <w:r>
-        <w:t>• Khi tên miền thuộc danh mục cấm: Proxy lập tức phản hồi bản ghi Synthetic A Record trỏ về 0.0.0.0 với TTL = 60s. Thời gian phản hồi nội bộ đạt 0.83 ms, nhanh hơn 40 lần so với truy vấn ra Internet.</w:t>
+        <w:t>• Ví dụ trực quan đời thường: Giống như một Nhân viên lễ tân thông minh túc trực ở cổng khu dân cư. Khi trẻ hỏi đường đến thư viện học tập (scratch.mit.edu), lễ tân tra danh bạ và chỉ đường chính xác. Nhưng khi trẻ hỏi đường đến quán cờ bạc hay web xấu (game-bai.com), lễ tân không quát mắng mà chỉ thẳng vào một ngõ cụt có bờ tường bịt kín (0.0.0.0). Trình duyệt chạy vào ngõ cụt và lập tức ngắt kết nối mà không tốn băng thông.</w:t>
         <w:br/>
-        <w:t>• Khi tên miền hợp lệ: Proxy chuyển tiếp tới DNS Upstream gia đình (1.1.1.3 - Cloudflare Families chặn malware).</w:t>
+        <w:t>• Lời giải kỹ thuật chuyên sâu: Tác tử OGK-Agent cấu hình card mạng Wi-Fi/Ethernet trỏ DNS chính về 127.0.0.1 và mở Socket UDP lắng nghe tại cổng 53 (RFC 1035). Khi nhận DNS Query, hệ thống đối soát bảng Domain Rules trong RAM theo thuật toán Subdomain Wildcard (*.domain.com). Nếu cấm: Phản hồi Synthetic A Record trỏ về 0.0.0.0 với TTL=60s trong thời gian siêu tốc chỉ 0.83 ms (nhanh hơn 40 lần truy vấn Internet). Nếu hợp lệ: Chuyển tiếp tới Cloudflare Families 1.1.1.3.</w:t>
         <w:br/>
-        <w:t>• Miễn nhiễm vĩnh viễn (NT6 Whitelist): Các cổng giáo dục (moet.gov.vn, *.edu.vn) và Tổng đài Quốc gia 111 được bảo vệ cứng trong mã nguồn.</w:t>
+        <w:t>• Bảo vệ bất khả xâm phạm (NT6): Các cổng giáo dục quốc gia (moet.gov.vn, *.edu.vn) và Tổng đài 111 được ghim cứng trong mã nguồn, máy chủ sẽ từ chối với ngoại lệ NT6ViolationError nếu ai cố tình tạo luật cấm.</w:t>
       </w:r>
     </w:p>
     <w:p>
@@ -265,16 +260,14 @@
         <w:pStyle w:val="Heading2"/>
       </w:pPr>
       <w:r>
-        <w:t>2.2 Cưỡng chế SafeSearch &amp; Vô hiệu hóa DoH</w:t>
+        <w:t>2.2 Cưỡng bức SafeSearch &amp; Vô hiệu hóa DoH (DNS over HTTPS)</w:t>
       </w:r>
     </w:p>
     <w:p>
       <w:r>
-        <w:t>• Google SafeSearch: Ghi đè CNAME / IP của google.com trỏ về forcesafesearch.google.com (216.239.38.120).</w:t>
+        <w:t>• SafeSearch hoạt động ra sao? Giống như việc dẫn con vào Đại siêu thị bách hóa (Google/YouTube) nhưng đi qua 'Cửa kiểm duyệt dành riêng cho thiếu nhi' nơi các quầy hàng người lớn bị che rèm kín mít. Về kỹ thuật: Các dịch vụ này chạy HTTPS cổng 443 nên không được bẻ khóa SSL nhằm tôn trọng quyền riêng tư (NT2). DNS Proxy của OGK bắt gói tin DNS và ghi đè bản ghi A trả về các địa chỉ IP VIP chuyên dụng cho trường học: forcesafesearch.google.com (216.239.38.120), strict.bing.com (204.79.197.220), restrict.youtube.com (216.239.38.119). Khi trình duyệt gửi yêu cầu tới các IP VIP này, máy chủ Google/YouTube cưỡng bức bật cờ SafeSearch: Strict ON và khóa xám nút gạt cài đặt, trẻ không thể nào tắt được!</w:t>
         <w:br/>
-        <w:t>• YouTube Restricted Mode: Ghi đè youtube.com trỏ về VIP restrict.youtube.com (216.239.38.119).</w:t>
-        <w:br/>
-        <w:t>• Chống vượt rào DoH: Bắt truy vấn Canary Domain 'use-application-dns.net' và trả về NXDOMAIN, buộc trình duyệt hiện đại tắt DoH và quay về DNS cổng 53.</w:t>
+        <w:t>• Đánh chặn DoH bằng NXDOMAIN: Trẻ bật 'Secure DNS' trong Chrome/Edge để mã hóa DNS qua cổng 443 nhằm lách luật. Theo chuẩn RFC của Mozilla/Chromium, trước khi bật DoH, trình duyệt bắt buộc phải truy vấn thử nghiệm tên miền Canary: 'use-application-dns.net'. DNS Proxy của OGK bắt gói tin này và trả về mã lỗi NXDOMAIN (RCODE=3). Nhận được mã này, trình duyệt tự hiểu mạng gia đình yêu cầu tắt DoH và tự động quay về sử dụng Socket DNS cổng 53 của hệ điều hành.</w:t>
       </w:r>
     </w:p>
     <w:p>
@@ -282,12 +275,14 @@
         <w:pStyle w:val="Heading2"/>
       </w:pPr>
       <w:r>
-        <w:t>2.3 Kiểm soát Ứng dụng bằng mã băm SHA-256</w:t>
+        <w:t>2.3 Kiểm soát Ứng dụng bằng mã băm SHA-256 (Chống đổi tên file)</w:t>
       </w:r>
     </w:p>
     <w:p>
       <w:r>
-        <w:t>Để triệt tiêu thủ thuật đổi tên file thực thi (ví dụ roblox.exe thành winword.exe), AppController quét tiến trình mỗi 3 giây và tính mã băm SHA-256 của file nhị phân trên đĩa. Cơ chế Cache theo mtime đảm bảo mức chiếm dụng CPU duy trì ở mức 0.0%.</w:t>
+        <w:t>• Ví dụ trực quan đời thường: Giống như một kẻ trốn trại cởi áo in chữ 'Roblox' (roblox.exe) mặc vào bộ vest in chữ 'Soạn thảo Word' (winword.exe). Người bảo vệ của OGK không nhìn vào chiếc áo ngoài (tên file), mà yêu cầu đặt tay lên máy quét vân tay sinh trắc học (Mã băm SHA-256). Dù thay 100 chiếc áo khác nhau, vân tay nhị phân của tệp game không đổi!</w:t>
+        <w:br/>
+        <w:t>• Lời giải kỹ thuật: AppController quét tiến trình mỗi 3 giây bằng psutil.process_iter(), trích xuất đường dẫn thực tế proc.exe() và tính mã băm SHA-256 của file nhị phân trên đĩa. Nếu trùng danh sách cấm, lập tức gọi proc.terminate() trong &lt;= 3s và hiện thông báo giải thích lý do cho trẻ (NT4). Bộ đệm mtime Cache cặp (file_path, mtime, sha256) giúp CPU chiếm dụng 0.0%.</w:t>
       </w:r>
     </w:p>
     <w:p>
@@ -303,20 +298,20 @@
         <w:pStyle w:val="Heading2"/>
       </w:pPr>
       <w:r>
-        <w:t>3.1 Gia cố Bảo mật F5 (NIST SP 800-63B &amp; OWASP ASVS v4)</w:t>
+        <w:t>3.1 DNSWatchdog là gì &amp; Giải pháp khi trẻ cố tình can thiệp?</w:t>
       </w:r>
     </w:p>
     <w:p>
       <w:r>
-        <w:t>• Mật khẩu &gt;= 10 ký tự kết hợp hàm băm Argon2id ngốn bộ nhớ, ngăn chặn tấn công GPU/ASIC.</w:t>
+        <w:t>• DNSWatchdog là gì? Giống như một Chú cảnh vệ đi tuần tra mỗi 20 giây một lần. Cứ 20 giây chú lại kiểm tra biển chỉ dẫn giao thông. Nếu ai đó (trẻ em) lén xoay biển sang 8.8.8.8 của Google, chú cảnh vệ lập tức dùng cờ-lê siết chặt và kéo biển quay ngược lại 127.0.0.1 bằng lệnh netsh, đồng thời gửi cảnh báo vi phạm về cho cha mẹ.</w:t>
         <w:br/>
-        <w:t>• Chống Brute-Force: Khóa tài khoản 15 phút sau 5 lần liên tiếp nhập sai mật khẩu (HTTP 423 Locked).</w:t>
+        <w:t>• Nhỡ trẻ tắt luôn DNSWatchdog trong Task Manager thì sao? Cơ chế phòng vệ 3 lớp của OGK giải quyết triệt để:</w:t>
         <w:br/>
-        <w:t>• In-memory IP Rate Limiting: 10 requests/phút/IP trên các endpoint xác thực và ghép đôi.</w:t>
+        <w:t xml:space="preserve">  1. Lớp 1 (Phân quyền Windows): Máy tính được thiết lập tài khoản của Trẻ là Standard User, Phụ huynh giữ quyền Administrator. Khi trẻ mở Task Manager bấm End Process vào tiến trình Agent (chạy đặc quyền High/System), nhân hệ điều hành Windows Security Reference Monitor lập tức chặn đứng với lỗi 'Access is Denied'.</w:t>
         <w:br/>
-        <w:t>• Chống IDOR: Mọi thao tác API điều khiển hay xem báo cáo đều xác thực quyền sở hữu thiết bị (device.parent_id == current_parent.id).</w:t>
+        <w:t xml:space="preserve">  2. Lớp 2 (Tự phục hồi Netsh): Nếu trẻ bằng cách nào đó đổi DNS card mạng, DNSWatchdog giật lại cấu hình 127.0.0.1 sau 20s.</w:t>
         <w:br/>
-        <w:t>• Mã hóa AES-256-GCM AEAD: Nonce 12 bytes + Auth Tag 16 bytes, bảo vệ tính toàn vẹn dữ liệu nhạy cảm.</w:t>
+        <w:t xml:space="preserve">  3. Lớp 3 (Tự khởi động cùng Windows): Module autostart.py tự ghi vào Registry HKCU\...\Run với pythonw.exe, đảm bảo mỗi khi bật máy Agent luôn tự chạy ngầm dưới khay hệ thống mà không có cửa sổ đen cmd.</w:t>
       </w:r>
     </w:p>
     <w:p>
@@ -324,14 +319,16 @@
         <w:pStyle w:val="Heading2"/>
       </w:pPr>
       <w:r>
-        <w:t>3.2 Tuân thủ Pháp lý Nghị định 13/2023/NĐ-CP</w:t>
+        <w:t>3.2 Đồng hồ Đơn điệu time.monotonic() &amp; Chế độ Tự trị Ngoại tuyến</w:t>
       </w:r>
     </w:p>
     <w:p>
       <w:r>
-        <w:t>• Tự động xóa dữ liệu sau 90 ngày: Tác vụ ngầm 24h tự động dọn dẹp các sự kiện viễn trắc và nhịp tim cũ.</w:t>
+        <w:t>• Đồng hồ đơn điệu vs Đồng hồ Windows: Trẻ lén vặn lùi đồng hồ treo tường Windows (time.time()) 2 tiếng để xin chơi thêm. Nhưng trọng tài OGK đeo trên cổ chiếc đồng hồ quả quýt chạy bằng lò xo cơ học (time.monotonic()) đọc trực tiếp từ bộ đếm xung nhịp vi xử lý phần cứng Win32 QueryPerformanceCounter. Giá trị này chỉ tăng đơn điệu theo thời gian thực, không thể bị vặn lùi bởi việc chỉnh giờ Windows hay tháo pin CMOS. Tích hợp IdleDetector dừng đếm khi trẻ rời máy &gt; 180s (GetLastInputInfo).</w:t>
         <w:br/>
-        <w:t>• Quyền yêu cầu xóa dữ liệu của trẻ (Right to Erasure): Phụ huynh nhập mật khẩu để kích hoạt lệnh xóa sạch dữ liệu trên Server và đồng bộ lệnh WebSocket xóa sạch bộ đệm SQLite ngoại tuyến của Agent.</w:t>
+        <w:t>• Trẻ rút dây mạng / ngắt Wi-Fi thì sao? OGK chuyển sang Chế độ Tự Trị Ngoại Tuyến (Autonomous Mode). Chính sách đã nạp trong SQLite cục bộ; ScreenTimeTracker tự đếm giờ và gọi SystemLocker tự khóa máy ngay lập tức khi hết giờ mà không cần mạng Internet! Viễn trắc vi phạm được đệm SQLite và tự động đồng bộ bù khi có mạng trở lại kèm idempotency_key.</w:t>
+        <w:br/>
+        <w:t>• Trẻ restart máy thì sao? Số phút dùng được lưu đều đặn vào SQLite. Khởi động lại máy, Agent nạp lại phút cũ và đếm tiếp, trẻ không thể reset giờ chơi bằng cách restart máy tính.</w:t>
       </w:r>
     </w:p>
     <w:p>
@@ -339,14 +336,20 @@
         <w:pStyle w:val="Heading2"/>
       </w:pPr>
       <w:r>
-        <w:t>3.3 Tác tử Chống Vượt rào M3 (Anti-Bypass Guard)</w:t>
+        <w:t>3.3 Gia cố Bảo mật F5 &amp; Tuân thủ Nghị định 13/2023/NĐ-CP</w:t>
       </w:r>
     </w:p>
     <w:p>
       <w:r>
-        <w:t>• DNSWatchdog: Luồng chạy ngầm quét mỗi 20 giây. Nếu phát hiện card mạng bị đổi sang 8.8.8.8 hay DHCP, lập tức khôi phục về 127.0.0.1 và gửi cảnh báo viễn trắc.</w:t>
+        <w:t>• Chuẩn mật khẩu NIST SP 800-63B: Mật khẩu &gt;= 10 ký tự, băm Argon2id (RAM 64MB, t=3, p=4) kháng máy đào GPU.</w:t>
         <w:br/>
-        <w:t>• Chặn VPN/Proxy: Gieo mầm sẵn các tiến trình VPN (WARP, ProtonVPN, Psiphon, UltraSurf) và tiêu diệt ngay lập tức trong vòng 3 giây.</w:t>
+        <w:t>• Chống Brute-Force: Khóa tài khoản 15 phút sau 5 lần liên tiếp nhập sai mật khẩu (HTTP 423 Locked).</w:t>
+        <w:br/>
+        <w:t>• Triệt tiêu 100% IDOR: Mọi API kiểm tra bắt buộc device.parent_id == current_parent.id, ngăn phụ huynh này can thiệp máy phụ huynh khác.</w:t>
+        <w:br/>
+        <w:t>• Tuân thủ Nghị định 13: Tự động tiêu hủy viễn trắc quá 90 ngày (chu kỳ 24h); quyền yêu cầu xóa dữ liệu của trẻ (Right to Erasure) xác thực mật khẩu phụ huynh và phát lệnh WebSocket xóa sạch dữ liệu trên Server lẫn máy con.</w:t>
+        <w:br/>
+        <w:t>• Chặn VPN/Proxy: AppController tiêu diệt các tiến trình WARP, ProtonVPN, Psiphon, UltraSurf trong vòng 3 giây.</w:t>
       </w:r>
     </w:p>
     <w:p>
@@ -913,7 +916,7 @@
     </w:p>
     <w:p>
       <w:r>
-        <w:t>Toàn bộ hệ thống Open Guardian Kids Version 0.4 đạt 61/61 Test Cases tự động PASSED (100%) trong 9.83 giây:</w:t>
+        <w:t>Toàn bộ hệ thống Open Guardian Kids Version 0.4 đạt 69/69 Test Cases tự động PASSED (100%):</w:t>
       </w:r>
     </w:p>
     <w:tbl>
@@ -1191,7 +1194,7 @@
               <w:rPr>
                 <w:sz w:val="18"/>
               </w:rPr>
-              <w:t>10 tests: Băm Argon2id, JWT tamper, Brute-force lockout, IP rate limit</w:t>
+              <w:t>15 tests: Băm Argon2id, JWT tamper, Brute-force lockout, Đăng ký phụ huynh, Phân quyền</w:t>
             </w:r>
           </w:p>
         </w:tc>
@@ -1207,7 +1210,7 @@
                 <w:color w:val="10B981"/>
                 <w:sz w:val="19"/>
               </w:rPr>
-              <w:t>10/10 PASSED (100%)</w:t>
+              <w:t>15/15 PASSED (100%)</w:t>
             </w:r>
           </w:p>
         </w:tc>
@@ -1238,7 +1241,7 @@
               <w:rPr>
                 <w:sz w:val="18"/>
               </w:rPr>
-              <w:t>6 tests: Ghép đôi 8 ký tự, TTL 10 phút, Chống mã dùng lại</w:t>
+              <w:t>7 tests: Ghép đôi 8 ký tự, TTL 10 phút, Chống mã dùng lại, API cấp mã</w:t>
             </w:r>
           </w:p>
         </w:tc>
@@ -1254,7 +1257,7 @@
                 <w:color w:val="10B981"/>
                 <w:sz w:val="19"/>
               </w:rPr>
-              <w:t>6/6 PASSED (100%)</w:t>
+              <w:t>7/7 PASSED (100%)</w:t>
             </w:r>
           </w:p>
         </w:tc>
@@ -1271,7 +1274,7 @@
                 <w:b/>
                 <w:sz w:val="18"/>
               </w:rPr>
-              <w:t>tests/test_heartbeat.py</w:t>
+              <w:t>tests/test_autostart.py</w:t>
             </w:r>
           </w:p>
         </w:tc>
@@ -1285,7 +1288,101 @@
               <w:rPr>
                 <w:sz w:val="18"/>
               </w:rPr>
+              <w:t>2 tests: Tự khởi động Windows Registry HKCU\...\Run, pythonw.exe nền</w:t>
+            </w:r>
+          </w:p>
+        </w:tc>
+        <w:tc>
+          <w:tcPr>
+            <w:tcW w:type="dxa" w:w="2160"/>
+            <w:shd w:val="clear" w:color="auto" w:fill="F8FAFC"/>
+          </w:tcPr>
+          <w:p>
+            <w:r>
+              <w:rPr>
+                <w:b/>
+                <w:color w:val="10B981"/>
+                <w:sz w:val="19"/>
+              </w:rPr>
+              <w:t>2/2 PASSED (100%)</w:t>
+            </w:r>
+          </w:p>
+        </w:tc>
+      </w:tr>
+      <w:tr>
+        <w:tc>
+          <w:tcPr>
+            <w:tcW w:type="dxa" w:w="3168"/>
+            <w:shd w:val="clear" w:color="auto" w:fill="FFFFFF"/>
+          </w:tcPr>
+          <w:p>
+            <w:r>
+              <w:rPr>
+                <w:b/>
+                <w:sz w:val="18"/>
+              </w:rPr>
+              <w:t>tests/test_heartbeat.py</w:t>
+            </w:r>
+          </w:p>
+        </w:tc>
+        <w:tc>
+          <w:tcPr>
+            <w:tcW w:type="dxa" w:w="4608"/>
+            <w:shd w:val="clear" w:color="auto" w:fill="FFFFFF"/>
+          </w:tcPr>
+          <w:p>
+            <w:r>
+              <w:rPr>
+                <w:sz w:val="18"/>
+              </w:rPr>
               <w:t>4 tests: Nhịp tim 60s, Ngưỡng 120s Online/Offline, Bearer Token</w:t>
+            </w:r>
+          </w:p>
+        </w:tc>
+        <w:tc>
+          <w:tcPr>
+            <w:tcW w:type="dxa" w:w="2160"/>
+            <w:shd w:val="clear" w:color="auto" w:fill="FFFFFF"/>
+          </w:tcPr>
+          <w:p>
+            <w:r>
+              <w:rPr>
+                <w:b/>
+                <w:color w:val="10B981"/>
+                <w:sz w:val="19"/>
+              </w:rPr>
+              <w:t>4/4 PASSED (100%)</w:t>
+            </w:r>
+          </w:p>
+        </w:tc>
+      </w:tr>
+      <w:tr>
+        <w:tc>
+          <w:tcPr>
+            <w:tcW w:type="dxa" w:w="3168"/>
+            <w:shd w:val="clear" w:color="auto" w:fill="F8FAFC"/>
+          </w:tcPr>
+          <w:p>
+            <w:r>
+              <w:rPr>
+                <w:b/>
+                <w:sz w:val="18"/>
+              </w:rPr>
+              <w:t>tests/test_policy.py</w:t>
+            </w:r>
+          </w:p>
+        </w:tc>
+        <w:tc>
+          <w:tcPr>
+            <w:tcW w:type="dxa" w:w="4608"/>
+            <w:shd w:val="clear" w:color="auto" w:fill="F8FAFC"/>
+          </w:tcPr>
+          <w:p>
+            <w:r>
+              <w:rPr>
+                <w:sz w:val="18"/>
+              </w:rPr>
+              <w:t>4 tests: Chữ ký HMAC-SHA256, Ma trận tuần 7x48, Anti-IDOR</w:t>
             </w:r>
           </w:p>
         </w:tc>
@@ -1318,7 +1415,7 @@
                 <w:b/>
                 <w:sz w:val="18"/>
               </w:rPr>
-              <w:t>tests/test_policy.py</w:t>
+              <w:t>tests/test_time_tracker.py</w:t>
             </w:r>
           </w:p>
         </w:tc>
@@ -1332,7 +1429,7 @@
               <w:rPr>
                 <w:sz w:val="18"/>
               </w:rPr>
-              <w:t>4 tests: Chữ ký HMAC-SHA256, Ma trận tuần 7x48, Anti-IDOR</w:t>
+              <w:t>4 tests: Bộ đếm đơn điệu time.monotonic, Chống tua giờ M6</w:t>
             </w:r>
           </w:p>
         </w:tc>
@@ -1365,7 +1462,7 @@
                 <w:b/>
                 <w:sz w:val="18"/>
               </w:rPr>
-              <w:t>tests/test_time_tracker.py</w:t>
+              <w:t>tests/test_websocket_command.py</w:t>
             </w:r>
           </w:p>
         </w:tc>
@@ -1379,7 +1476,7 @@
               <w:rPr>
                 <w:sz w:val="18"/>
               </w:rPr>
-              <w:t>4 tests: Bộ đếm đơn điệu time.monotonic, Chống tua giờ M6</w:t>
+              <w:t>1 test: Kênh truyền song công khẩn cấp &lt; 500ms</w:t>
             </w:r>
           </w:p>
         </w:tc>
@@ -1387,53 +1484,6 @@
           <w:tcPr>
             <w:tcW w:type="dxa" w:w="2160"/>
             <w:shd w:val="clear" w:color="auto" w:fill="F8FAFC"/>
-          </w:tcPr>
-          <w:p>
-            <w:r>
-              <w:rPr>
-                <w:b/>
-                <w:color w:val="10B981"/>
-                <w:sz w:val="19"/>
-              </w:rPr>
-              <w:t>4/4 PASSED (100%)</w:t>
-            </w:r>
-          </w:p>
-        </w:tc>
-      </w:tr>
-      <w:tr>
-        <w:tc>
-          <w:tcPr>
-            <w:tcW w:type="dxa" w:w="3168"/>
-            <w:shd w:val="clear" w:color="auto" w:fill="FFFFFF"/>
-          </w:tcPr>
-          <w:p>
-            <w:r>
-              <w:rPr>
-                <w:b/>
-                <w:sz w:val="18"/>
-              </w:rPr>
-              <w:t>tests/test_websocket_command.py</w:t>
-            </w:r>
-          </w:p>
-        </w:tc>
-        <w:tc>
-          <w:tcPr>
-            <w:tcW w:type="dxa" w:w="4608"/>
-            <w:shd w:val="clear" w:color="auto" w:fill="FFFFFF"/>
-          </w:tcPr>
-          <w:p>
-            <w:r>
-              <w:rPr>
-                <w:sz w:val="18"/>
-              </w:rPr>
-              <w:t>1 test: Kênh truyền song công khẩn cấp &lt; 500ms</w:t>
-            </w:r>
-          </w:p>
-        </w:tc>
-        <w:tc>
-          <w:tcPr>
-            <w:tcW w:type="dxa" w:w="2160"/>
-            <w:shd w:val="clear" w:color="auto" w:fill="FFFFFF"/>
           </w:tcPr>
           <w:p>
             <w:r>

</xml_diff>